<commit_message>
brief description of what you changed
</commit_message>
<xml_diff>
--- a/HOW TO PUSH.docx
+++ b/HOW TO PUSH.docx
@@ -55,35 +55,31 @@
       </w:r>
     </w:p>
     <w:p>
-      <w:proofErr w:type="spellStart"/>
       <w:r>
-        <w:t>git</w:t>
+        <w:t>git push origin main</w:t>
       </w:r>
-      <w:proofErr w:type="spellEnd"/>
+    </w:p>
+    <w:p/>
+    <w:p/>
+    <w:p/>
+    <w:p>
+      <w:pPr>
+        <w:rPr>
+          <w:lang w:val="en-US"/>
+        </w:rPr>
+      </w:pPr>
       <w:r>
-        <w:t xml:space="preserve"> </w:t>
+        <w:rPr>
+          <w:lang w:val="en-US"/>
+        </w:rPr>
+        <w:t>Resume is in static/u</w:t>
       </w:r>
-      <w:proofErr w:type="spellStart"/>
       <w:r>
-        <w:t>push</w:t>
+        <w:rPr>
+          <w:lang w:val="en-US"/>
+        </w:rPr>
+        <w:t>ploads</w:t>
       </w:r>
-      <w:proofErr w:type="spellEnd"/>
-      <w:r>
-        <w:t xml:space="preserve"> </w:t>
-      </w:r>
-      <w:proofErr w:type="spellStart"/>
-      <w:r>
-        <w:t>origin</w:t>
-      </w:r>
-      <w:proofErr w:type="spellEnd"/>
-      <w:r>
-        <w:t xml:space="preserve"> </w:t>
-      </w:r>
-      <w:proofErr w:type="spellStart"/>
-      <w:r>
-        <w:t>main</w:t>
-      </w:r>
-      <w:proofErr w:type="spellEnd"/>
     </w:p>
     <w:p>
       <w:pPr>
@@ -704,6 +700,7 @@
   <w:style w:type="character" w:default="1" w:styleId="DefaultParagraphFont">
     <w:name w:val="Default Paragraph Font"/>
     <w:uiPriority w:val="1"/>
+    <w:semiHidden/>
     <w:unhideWhenUsed/>
   </w:style>
   <w:style w:type="table" w:default="1" w:styleId="TableNormal">

</xml_diff>